<commit_message>
Update resume PDF and DOCX in uploads
Co-Authored-By: Claude Opus 4.7 (1M context) <noreply@anthropic.com>
</commit_message>
<xml_diff>
--- a/uploads/Efrain_Plascencia_Resume.docx
+++ b/uploads/Efrain_Plascencia_Resume.docx
@@ -2210,6 +2210,9 @@
               <w:spacing w:after="80"/>
             </w:pPr>
             <w:r>
+              <w:rPr>
+                <w:noProof/>
+              </w:rPr>
               <w:drawing>
                 <wp:inline distT="0" distB="0" distL="0" distR="0" wp14:anchorId="6E1E5798" wp14:editId="3751C485">
                   <wp:extent cx="6858000" cy="9525"/>
@@ -2345,10 +2348,10 @@
           <w:noProof/>
         </w:rPr>
         <w:drawing>
-          <wp:inline distT="0" distB="0" distL="0" distR="0" wp14:anchorId="579B0757" wp14:editId="6FFA0CCA">
-            <wp:extent cx="1492250" cy="1492250"/>
+          <wp:inline distT="0" distB="0" distL="0" distR="0" wp14:anchorId="0E3C36C6" wp14:editId="46834AA4">
+            <wp:extent cx="1974850" cy="1974850"/>
             <wp:effectExtent l="0" t="0" r="0" b="0"/>
-            <wp:docPr id="337988799" name="Picture 6"/>
+            <wp:docPr id="1619244492" name="Graphic 4"/>
             <wp:cNvGraphicFramePr>
               <a:graphicFrameLocks xmlns:a="http://schemas.openxmlformats.org/drawingml/2006/main" noChangeAspect="1"/>
             </wp:cNvGraphicFramePr>
@@ -2356,11 +2359,17 @@
               <a:graphicData uri="http://schemas.openxmlformats.org/drawingml/2006/picture">
                 <pic:pic xmlns:pic="http://schemas.openxmlformats.org/drawingml/2006/picture">
                   <pic:nvPicPr>
-                    <pic:cNvPr id="337988799" name="Picture 337988799"/>
+                    <pic:cNvPr id="1619244492" name="Graphic 1619244492"/>
                     <pic:cNvPicPr/>
                   </pic:nvPicPr>
                   <pic:blipFill>
-                    <a:blip r:embed="rId8"/>
+                    <a:blip r:embed="rId8">
+                      <a:extLst>
+                        <a:ext uri="{96DAC541-7B7A-43D3-8B79-37D633B846F1}">
+                          <asvg:svgBlip xmlns:asvg="http://schemas.microsoft.com/office/drawing/2016/SVG/main" r:embed="rId9"/>
+                        </a:ext>
+                      </a:extLst>
+                    </a:blip>
                     <a:stretch>
                       <a:fillRect/>
                     </a:stretch>
@@ -2368,7 +2377,7 @@
                   <pic:spPr>
                     <a:xfrm>
                       <a:off x="0" y="0"/>
-                      <a:ext cx="1492250" cy="1492250"/>
+                      <a:ext cx="1974850" cy="1974850"/>
                     </a:xfrm>
                     <a:prstGeom prst="rect">
                       <a:avLst/>
@@ -2383,11 +2392,6 @@
       <w:r>
         <w:br/>
       </w:r>
-    </w:p>
-    <w:p>
-      <w:pPr>
-        <w:spacing w:after="80"/>
-      </w:pPr>
     </w:p>
     <w:sectPr>
       <w:pgSz w:w="12240" w:h="15840"/>
@@ -3208,6 +3212,7 @@
   <w:style w:type="character" w:default="1" w:styleId="DefaultParagraphFont">
     <w:name w:val="Default Paragraph Font"/>
     <w:uiPriority w:val="1"/>
+    <w:semiHidden/>
     <w:unhideWhenUsed/>
   </w:style>
   <w:style w:type="table" w:default="1" w:styleId="TableNormal">

</xml_diff>